<commit_message>
Fill response letter author details and update date
Co-Authored-By: Tatsuki Onishi <bougtoir@gmail.com>
</commit_message>
<xml_diff>
--- a/vaporizer-price-study/papers/jatm_response_to_reviewers_R1.docx
+++ b/vaporizer-price-study/papers/jatm_response_to_reviewers_R1.docx
@@ -14,7 +14,7 @@
           <w:i w:val="0"/>
           <w:sz w:val="24"/>
         </w:rPr>
-        <w:t>13 August 2026</w:t>
+        <w:t>14 August 2026</w:t>
       </w:r>
     </w:p>
     <w:p>
@@ -352,7 +352,7 @@
           <w:i w:val="0"/>
           <w:sz w:val="24"/>
         </w:rPr>
-        <w:t>[Corresponding author name]</w:t>
+        <w:t>Onishi Tatsuki</w:t>
       </w:r>
     </w:p>
     <w:p>
@@ -367,7 +367,7 @@
           <w:i w:val="0"/>
           <w:sz w:val="24"/>
         </w:rPr>
-        <w:t>[Affiliation]</w:t>
+        <w:t>Data Science and AI Innovation Research Promotion Center, Shiga University</w:t>
       </w:r>
     </w:p>
     <w:p>
@@ -382,7 +382,7 @@
           <w:i w:val="0"/>
           <w:sz w:val="24"/>
         </w:rPr>
-        <w:t>Email: [email]</w:t>
+        <w:t>E-mail: bougtoir@gmail.com</w:t>
       </w:r>
     </w:p>
     <w:sectPr>

</xml_diff>